<commit_message>
Revisao geral: textos mais simples e correcao de caminhos
QA de tudo que estava publicado:

- Corrigidos quatro caminhos que ficaram desatualizados e nao existem neste
  repositorio (atividades/atividade2-riak, atividades/atividade3-cassandra,
  atividades/atividade4-neo4j), e duas referencias a uma pasta scripts/ que
  nao foi publicada aqui.
- Todos os READMEs reescritos mais curtos e diretos, sem travessao.
- Dissertacao da Atividade 5 refeita em tom menos formal e cortada ate caber
  nas 30 linhas. A contagem antiga era estimativa e estava errada: o texto
  tinha 38 linhas e duas paginas. Agora sao 30 linhas e uma pagina, medidas
  no Word.
- GeoLog registrado como trabalho individual.

Conferido ao fim: nenhum link quebrado, nenhum caminho inexistente.
</commit_message>
<xml_diff>
--- a/atividade5-dissertacao/Atividade5-Dissertacao-PedroOliveira.docx
+++ b/atividade5-dissertacao/Atividade5-Dissertacao-PedroOliveira.docx
@@ -5,29 +5,16 @@
     <w:p>
       <w:pPr>
         <w:spacing w:line="240" w:lineRule="auto"/>
-        <w:jc w:val="center"/>
       </w:pPr>
       <w:r>
         <w:rPr>
           <w:b/>
         </w:rPr>
-        <w:t>Atividade 5 — Dissertação</w:t>
+        <w:t>Atividade 5</w:t>
         <w:br/>
-        <w:t>Implementação e Gerenciamento de Bancos de Dados NoSQL</w:t>
+        <w:t>Bancos de Dados NoSQL</w:t>
         <w:br/>
         <w:t>Pedro Oliveira</w:t>
-      </w:r>
-    </w:p>
-    <w:p>
-      <w:pPr>
-        <w:spacing w:line="240" w:lineRule="auto"/>
-      </w:pPr>
-      <w:r>
-        <w:rPr>
-          <w:i/>
-          <w:sz w:val="20"/>
-        </w:rPr>
-        <w:t>Questões da prova discursiva CESPE/CEBRASPE, DGP/PF 2018, Perito Criminal Federal, Área 3.</w:t>
       </w:r>
     </w:p>
     <w:p>
@@ -38,7 +25,7 @@
         <w:t xml:space="preserve">1. </w:t>
       </w:r>
       <w:r>
-        <w:t>Banco de dados não relacional, ou NoSQL, é o nome dado aos sistemas que abandonam o modelo de tabelas e relações e organizam o dado em estruturas próprias, sem esquema fixo validado na escrita. O esquema não some: passa a ser aplicado pelo programa, na leitura. Duas vantagens sobre o relacional. A escala horizontal, porque a unidade de dado é autossuficiente e não há junção entre registros guardados em máquinas diferentes, de modo que acrescentar servidor acrescenta capacidade. E a flexibilidade de forma, porque registros de uma mesma coleção podem ter campos diferentes e incluir um campo novo não exige migração, o que atende o dado não estruturado citado no texto.</w:t>
+        <w:t>NoSQL é o nome dado aos bancos que não usam o modelo de tabelas e relações. Guardam o dado em estruturas próprias e não exigem esquema fixo na gravação: o esquema continua existindo, mas quem aplica é o programa, na leitura. A primeira vantagem sobre o relacional é a escala horizontal, porque cada registro se basta e não há junção entre máquinas, então ganhar capacidade é acrescentar servidor. A segunda é a liberdade de forma: registros de uma mesma coleção podem ter campos diferentes e incluir um campo novo não exige migração, o que atende o dado não estruturado do texto.</w:t>
       </w:r>
     </w:p>
     <w:p>
@@ -49,7 +36,7 @@
         <w:t xml:space="preserve">2. </w:t>
       </w:r>
       <w:r>
-        <w:t>No modelo de documentos o dado é um agregado em JSON ou BSON, lido e gravado por inteiro, com consulta por qualquer campo interno e índices secundários, inclusive geoespaciais. Dispensa junção, porque o que seria um conjunto de tabelas vira um documento só. É o modelo do MongoDB. No modelo de chave-valor o banco guarda um par identificador e conteúdo e trata o valor como opaco: não há consulta por conteúdo, apenas pela chave, o que torna o custo de acesso previsível e baixo. Atende sessão, cache, contador e fila. São exemplos o Redis, que tipa o valor em estruturas como lista e conjunto ordenado, e o Riak, distribuído e sem nó líder. No modelo de família de colunas as linhas são distribuídas por uma chave de partição e a modelagem é dirigida pela consulta: define-se antes o que será perguntado e a tabela é construída para responder àquilo, o que sustenta volume alto de escrita e crescimento por acréscimo de nós. É o modelo do Cassandra. Há ainda o modelo de grafos, como o Neo4j, em que o relacionamento é o próprio dado e o custo da travessia depende da vizinhança, não do tamanho da base.</w:t>
+        <w:t>No modelo de documentos o dado é um bloco em JSON ou BSON, lido e gravado inteiro, com consulta por qualquer campo interno e índices secundários. Dispensa junção, porque o que seriam várias tabelas vira um documento só. É o caso do MongoDB. No modelo de chave-valor o banco guarda um par de identificador e conteúdo e não olha dentro do valor: não há consulta por conteúdo, só pela chave, o que deixa o acesso barato e previsível. Redis e Riak são exemplos. No modelo de família de colunas as linhas se espalham por uma chave de partição e a modelagem parte da consulta, definindo antes o que será perguntado para montar a tabela que responde aquilo, o que sustenta volume alto de escrita. É o caso do Cassandra. Há ainda o modelo de grafos, como o Neo4j, em que o relacionamento é o próprio dado.</w:t>
       </w:r>
     </w:p>
     <w:p>
@@ -60,12 +47,12 @@
         <w:t xml:space="preserve">3. </w:t>
       </w:r>
       <w:r>
-        <w:t>A ausência de SQL não elimina a injeção, apenas muda a forma. No MongoDB a consulta é um objeto, e quando o programa monta esse objeto com entrada do usuário sem validar o tipo, o atacante envia um operador no lugar de um valor: um campo de senha que recebe $ne igual a nulo passa a casar com qualquer documento e derruba a autenticação, e operadores como $gt e $regex permitem extrair conteúdo por tentativa. O operador $where agrava o quadro por executar JavaScript no servidor. A tipagem fraca e o esquema aplicado só na leitura favorecem o ataque, porque o banco aceita um objeto onde se esperava texto e não acusa nada. A defesa é a de sempre, adaptada: validar e converter o tipo da entrada antes de montar a consulta, nunca interpolar texto do usuário na estrutura do filtro, desabilitar JavaScript no servidor, usar validação por JSON Schema na coleção e dar ao programa o menor privilégio possível.</w:t>
+        <w:t>Não ter SQL não livra de injeção, só muda o formato. No MongoDB a consulta é um objeto, e se o programa monta esse objeto com o que o usuário digitou sem conferir o tipo, o atacante manda um operador no lugar de um valor: um campo de senha que recebe $ne com valor nulo casa com qualquer documento e a autenticação cai. Com $gt e $regex dá para extrair conteúdo por tentativa, e o $where executa JavaScript no servidor. A tipagem fraca ajuda, porque o banco aceita um objeto onde se esperava texto. A defesa é converter o tipo da entrada antes de montar a consulta, nunca juntar texto do usuário à estrutura do filtro, desligar JavaScript no servidor e dar ao programa o menor privilégio.</w:t>
       </w:r>
     </w:p>
     <w:sectPr>
       <w:pgSz w:w="12240" w:h="15840"/>
-      <w:pgMar w:top="1417" w:right="1701" w:bottom="1417" w:left="1701" w:header="720" w:footer="720" w:gutter="0"/>
+      <w:pgMar w:top="1417" w:right="1417" w:bottom="1417" w:left="1417" w:header="720" w:footer="720" w:gutter="0"/>
       <w:cols w:space="720"/>
       <w:docGrid w:linePitch="360"/>
     </w:sectPr>

</xml_diff>